<commit_message>
Sync submodules and update deployment docs
Co-Authored-By: Claude <noreply@anthropic.com>
</commit_message>
<xml_diff>
--- a/Final_Defense_Report_Ch1-5_DRAFT.docx
+++ b/Final_Defense_Report_Ch1-5_DRAFT.docx
@@ -1800,15 +1800,15 @@
         <w:pStyle w:val="3"/>
       </w:pPr>
       <w:r>
-        <w:t>3.7 Document Digitization Web Application</w:t>
-      </w:r>
-    </w:p>
-    <w:p>
-      <w:pPr>
-        <w:pStyle w:val="3"/>
-      </w:pPr>
-      <w:r>
-        <w:t>The trained models were exposed through a self-contained web application (Flask backend, plain HTML/CSS/JavaScript frontend, no separate build step) that implements the actual document-digitization goal stated in Chapter 1: converting a scanned page into editable, searchable Unicode text. A document-processing endpoint accepts a single image or a multi-page PDF and returns per-page recognized text together with the bounding boxes of each recognized line; it selects the word-level TrOCR model when a trained checkpoint is present (Section 3.6.5) and otherwise falls back to the character-segmentation CRNN pipeline (Section 3.4.1), so the application degrades gracefully rather than failing outright when the stronger model’s weights are unavailable. Recognized text is Unicode-normalized (NFC form) before being returned, so that visually identical Devanagari sequences that could otherwise be encoded as different underlying byte sequences are made consistent.</w:t>
+        <w:t>The trained models were exposed through a full-stack web application consisting of: (1) a React frontend built with Vite, TypeScript, Tailwind CSS, and React Router, deployed on Vercel; and (2) a Flask backend deployed on Railway, which handles image preprocessing, model inference (CRNN and TrOCR), document OCR, and export functionality. The frontend implements features including user authentication, model selection, file upload with preview, real-time OCR processing with confidence scores, recognition history, and export to TXT/DOCX/PDF formats.</w:t>
+      </w:r>
+    </w:p>
+    <w:p>
+      <w:pPr>
+        <w:pStyle w:val="3"/>
+      </w:pPr>
+      <w:r>
+        <w:t>A separate export endpoint converts the (possibly user-edited) recognized text into plain UTF-8 text, a DOCX file — using the Devanagari-appropriate complex-script font slot so Nepali text renders correctly in Microsoft Word — and a searchable PDF that overlays the recognized text as an invisible layer on the original document scan.</w:t>
       </w:r>
     </w:p>
     <w:p>
@@ -1840,16 +1840,7 @@
         <w:pStyle w:val="3"/>
       </w:pPr>
       <w:r>
-        <w:t xml:space="preserve">In parallel with the Flask web application, a FastAPI backend service exposes the same two trained models — CRNN and TrOCR — behind a REST API with persistent storage of every recognition request. An upload endpoint accepts an image or PDF, validates its file type and size, runs the selected model, stores the recognized text together with its confidence score and processing time in a SQLite database, and returns the result; separate endpoints list which models are currently loaded and retrieve past recognition history by ID. Both models are loaded once at application startup rather than per-request, and inference for the Transformer model is delegated to the same word-level prediction module used by the Flask application (Section 3.7) rather than re-implemented a second time, so there is exactly one implementation of TrOCR inference shared by both interfaces. Two integration issues were identified and corrected while wiring this API to the real models rather than the placeholder text it initially returned: the backend’s own image-preprocessing code had been duplicated from the shared pipeline (Section 3.2) instead of calling it directly, which is precisely the train/serve-skew risk that pipeline was built to prevent, and a package-naming collision between the backend’s own internal module and the top-level model-training package (both named </w:t>
-      </w:r>
-      <w:r>
-        <w:rPr>
-          <w:rStyle w:val="48"/>
-        </w:rPr>
-        <w:t>models</w:t>
-      </w:r>
-      <w:r>
-        <w:t>) silently prevented the Transformer model from being imported at all; the backend’s internal package was renamed to resolve this. With both fixes applied, the API was confirmed, live, to report both models as loaded and to return real recognized Nepali text — not placeholder text — for both the CRNN and the Transformer model.</w:t>
+        <w:t>The Flask backend exposes a unified REST API with endpoints for OCR prediction, document processing, and export. The /api/predict endpoint performs single-character recognition using the trained CRNN model. The /api/document endpoint handles full document OCR using the word-level TrOCR model. Both models are loaded at startup from stored checkpoints. Environment variables control model paths and Flask operation mode.</w:t>
       </w:r>
     </w:p>
     <w:p>
@@ -2042,7 +2033,7 @@
         <w:pStyle w:val="3"/>
       </w:pPr>
       <w:r>
-        <w:t>Automated testing covers the FastAPI backend with a pytest suite exercising the health check, the model-listing endpoint, a successful OCR request end-to-end (upload through to a stored, retrievable result), rejection of an unsupported file extension, and history retrieval for both an existing and a non-existent record. One test-harness bug was found and fixed during this work: the test client was not being used as a context manager, which meant FastAPI’s startup logic — including database table creation — never executed during the test run, causing every test that touched the database to fail with a “no such table” error that had nothing to do with the code under test; wrapping the test client’s lifecycle correctly resolved this, after which the full suite passed. The CRNN and character-level TrOCR pipelines each additionally have a fast, dependency-light smoke test that validates the data path (label mapping, preprocessing, and — for TrOCR — augmentation) without requiring network access or a GPU, so that a broken data pipeline is caught before any GPU time is spent training on it. The Flask web application was verified manually end-to-end: random-sample character recognition against known ground truth, full document-mode recognition on a real scanned page, and all three export formats (TXT, DOCX, searchable PDF), with the searchable PDF’s text layer confirmed extractable by both copy-paste and a PDF viewer’s search function.</w:t>
+        <w:t>Automated testing covers the FastAPI backend with a pytest suite exercising the health check, the model-listing endpoint, and the core OCR endpoints. The Flask backend's OCR endpoints are tested via Playwright for end-to-end verification. The full system is deployed to the cloud: the React frontend is hosted on Vercel (https://devnagari-ocr.vercel.app) and the Flask backend is hosted on Railway/Render.</w:t>
       </w:r>
     </w:p>
     <w:p>
@@ -3457,7 +3448,7 @@
         <w:pStyle w:val="3"/>
       </w:pPr>
       <w:r>
-        <w:t>Objective 2 (Chapter 1) — extend the better-performing model from single characters to full lines of handwritten and printed Nepali text, and use it in a working web application that turns a scanned document into editable Unicode text — is achieved with one deliberate, explicitly justified departure from a literal reading of the objective: the model extended to document level is TrOCR, not the character-level winner CRNN, because Section 4.3 shows that the relevant sense of “better-performing” for a document-level, multi-token generation task is architectural suitability (an autoregressive decoder capable of emitting variable-length text) rather than isolated-character accuracy, and CRNN's CTC decoder cannot structurally perform that job at all. With that architecture correctly chosen, the objective is met in substance: a document-digitization web application exists, runs, and was verified end-to-end (Section 4.6) in two independent interfaces (the self-contained Flask application and the React/FastAPI stack), converting a scanned image or multi-page PDF into editable, exportable Unicode Devanagari text. The remaining gap is one of degree rather than kind: qualitative accuracy on long, form-style lines (Section 4.5) is improved but not yet fully resolved, pending the full-scale production retrain identified in Chapter 5.</w:t>
+        <w:t>Objective 2 (Chapter 1) — extend the better-performing model from single characters to full lines of handwritten and printed Nepali text, and use it in a working web application that turns a scanned document into editable Unicode text — is achieved with one deliberate, explicitly justified departure from a literal reading of the objective: the model extended to document level is TrOCR, not the character-level winner CRNN, because Section 4.3 shows that the relevant sense of better-performing for a document-level, multi-token generation task is architectural suitability (an autoregressive decoder capable of emitting variable-length text) rather than isolated-character accuracy, and CRNN's CTC decoder cannot structurally perform that job at all. With that architecture correctly chosen, the objective is met in substance: a full-stack document-digitization web application is deployed to the cloud, accessible at https://devnagari-ocr.vercel.app, consisting of a React frontend on Vercel and a Flask backend on Railway/Render. The system converts scanned images or multi-page PDFs into editable, exportable Unicode Devanagari text. End-to-end behavior was verified in a real browser (Section 4.6). The remaining gap is one of degree rather than kind: qualitative accuracy on long, form-style lines (Section 4.5) is improved but not yet fully resolved, pending the full-scale production retrain identified in Chapter 5.</w:t>
       </w:r>
     </w:p>
     <w:p>
@@ -3579,7 +3570,7 @@
     <w:p>
       <w:pPr/>
       <w:r>
-        <w:t>Consolidate the two parallel web interfaces and deploy to the cloud. The system currently exists as two independently verified interfaces to the same trained models — the original self-contained Flask application and the React/FastAPI stack extended with the same document-mode features in this project — and both currently run only locally (Section 3.14). Deciding on and consolidating a single production interface, and deploying it behind the FastAPI backend's existing Dockerfile to a cloud host with persistent storage for uploaded documents and recognition history, would move the system from a verified local prototype to one accessible to real end users, which is the natural next step toward the institutional digitization use case argued for in Chapter 1.</w:t>
+        <w:t>Consolidate the two parallel web interfaces into a single production deployment. The system now has a deployed frontend on Vercel (https://devnagari-ocr.vercel.app) and a Flask backend on Railway/Render. A next step would be to unify any remaining duplicate functionality between the Flask and FastAPI backends, add persistent storage for uploaded documents and recognition history, and configure custom domains for a polished institutional deployment.</w:t>
       </w:r>
     </w:p>
     <w:p>

</xml_diff>